<commit_message>
Actualizacion vie. 02/10/2026 13:28:14,67
</commit_message>
<xml_diff>
--- a/documentacion/liquidaciones_provisorias.docx
+++ b/documentacion/liquidaciones_provisorias.docx
@@ -1439,6 +1439,46 @@
       </w:pPr>
       <w:r>
         <w:t xml:space="preserve">En la pantalla de alta/edición, la "Diferencia" se muestra como Haber − Debe (igual que antes); el saldo consolidado usa ese mismo signo en esa pantalla.</w:t>
+      </w:r>
+    </w:p>
+    <w:p>
+      <w:pPr>
+        <w:pStyle w:val="ListParagraph"/>
+        <w:numPr>
+          <w:ilvl w:val="0"/>
+          <w:numId w:val="2"/>
+        </w:numPr>
+        <w:spacing w:after="60"/>
+      </w:pPr>
+      <w:r>
+        <w:rPr>
+          <w:b/>
+          <w:bCs/>
+        </w:rPr>
+        <w:t xml:space="preserve">Notas de Crédito</w:t>
+      </w:r>
+      <w:r>
+        <w:t xml:space="preserve"> (regla unificada el 02/10/2026): una NC siempre reduce el saldo. Vinculada en </w:t>
+      </w:r>
+      <w:r>
+        <w:rPr>
+          <w:b/>
+          <w:bCs/>
+        </w:rPr>
+        <w:t xml:space="preserve">Debe</w:t>
+      </w:r>
+      <w:r>
+        <w:t xml:space="preserve"> resta del Debe; vinculada en </w:t>
+      </w:r>
+      <w:r>
+        <w:rPr>
+          <w:b/>
+          <w:bCs/>
+        </w:rPr>
+        <w:t xml:space="preserve">Haber</w:t>
+      </w:r>
+      <w:r>
+        <w:t xml:space="preserve"> suma al Haber, como un pago. La misma regla usan el listado, la pantalla de edición (las NC llevan la etiqueta "NC"), Diferencias, el PDF y el Excel. Antes el saldo guardado tomaba la NC en negativo también en Haber, y por eso el listado podía mostrar otro saldo que la pantalla de edición.</w:t>
       </w:r>
     </w:p>
     <w:p>

</xml_diff>